<commit_message>
Add anonymized paper render outputs (PDF + per-page frames) and refresh draft
- PNAD_anonymous_workshop_paper.docx (regenerated) and .pdf print render.
- pnad_render_check.pdf + pnad_render_pages/page-*.png: render verification frames.
- paper_draft_builder.py updated.
</commit_message>
<xml_diff>
--- a/PNAD_anonymous_workshop_paper.docx
+++ b/PNAD_anonymous_workshop_paper.docx
@@ -3794,6 +3794,63 @@
     <w:p>
       <w:pPr>
         <w:keepNext/>
+        <w:spacing w:before="140" w:after="60"/>
+      </w:pPr>
+      <w:r>
+        <w:rPr>
+          <w:rFonts w:ascii="Times New Roman" w:hAnsi="Times New Roman"/>
+          <w:b/>
+          <w:i w:val="0"/>
+          <w:sz w:val="22"/>
+        </w:rPr>
+        <w:t>5.2 Threats to reproducibility</w:t>
+      </w:r>
+    </w:p>
+    <w:p>
+      <w:pPr>
+        <w:spacing w:line="259" w:lineRule="auto"/>
+      </w:pPr>
+      <w:r>
+        <w:rPr>
+          <w:rFonts w:ascii="Times New Roman" w:hAnsi="Times New Roman"/>
+          <w:b w:val="0"/>
+          <w:i w:val="0"/>
+          <w:sz w:val="22"/>
+        </w:rPr>
+        <w:t>Empirical reproducibility can fail even when the model code is small. Different data-download mirrors, parser versions, random-number defaults, or silent removal of metadata columns can change a benchmark experiment. The companion artifact therefore pins requirements, retains lightweight metadata subsets, records split definitions and seeds, and provides a checklist of exact reproduction commands. Tests cover the query-policy distinctions and the evaluation guards that are most likely to change the study's interpretation.</w:t>
+      </w:r>
+    </w:p>
+    <w:p>
+      <w:pPr>
+        <w:spacing w:line="259" w:lineRule="auto"/>
+      </w:pPr>
+      <w:r>
+        <w:rPr>
+          <w:rFonts w:ascii="Times New Roman" w:hAnsi="Times New Roman"/>
+          <w:b w:val="0"/>
+          <w:i w:val="0"/>
+          <w:sz w:val="22"/>
+        </w:rPr>
+        <w:t>Reproducibility does not imply that every rerun will yield identical hardware-level timing or that a different library release will report the same floating-point value. The relevant standard here is stronger than a screenshot but narrower than a production audit: an independent reader should be able to reconstruct the comparisons, observe the direction and statistical status of the active-learning result, and identify where a changed dependency or dataset version alters a conclusion. Any public release should archive the precise dataset preparation instructions allowed by the dataset licenses.</w:t>
+      </w:r>
+    </w:p>
+    <w:p>
+      <w:pPr>
+        <w:spacing w:line="259" w:lineRule="auto"/>
+      </w:pPr>
+      <w:r>
+        <w:rPr>
+          <w:rFonts w:ascii="Times New Roman" w:hAnsi="Times New Roman"/>
+          <w:b w:val="0"/>
+          <w:i w:val="0"/>
+          <w:sz w:val="22"/>
+        </w:rPr>
+        <w:t>The anonymized paper separates these provenance details from identity. Before double-blind submission, the artifact and supplementary material should be checked for author names, local machine paths, account names, revision history, and repository links. That process is also useful outside peer review: provenance that is explicit and machine-readable makes it easier for later users to distinguish a regenerated result from a result that was copied or manually edited.</w:t>
+      </w:r>
+    </w:p>
+    <w:p>
+      <w:pPr>
+        <w:keepNext/>
         <w:spacing w:before="200" w:after="60"/>
       </w:pPr>
       <w:r>
@@ -3818,6 +3875,34 @@
           <w:sz w:val="22"/>
         </w:rPr>
         <w:t>The companion artifact freezes data-preparation commands, package versions, random seeds, split definitions, and evaluation commands. It includes metadata-preserving subsets, a leakage guard for likely label columns, 66 tests, and scripts for active-learning statistics, strict generalization, cross-dataset transfer, and operating-point evaluation. The artifact is designed so that each table in this paper can be regenerated from a named command. An anonymized repository must remove author identity, machine paths, and application materials before submission.</w:t>
+      </w:r>
+    </w:p>
+    <w:p>
+      <w:pPr>
+        <w:spacing w:line="259" w:lineRule="auto"/>
+      </w:pPr>
+      <w:r>
+        <w:rPr>
+          <w:rFonts w:ascii="Times New Roman" w:hAnsi="Times New Roman"/>
+          <w:b w:val="0"/>
+          <w:i w:val="0"/>
+          <w:sz w:val="22"/>
+        </w:rPr>
+        <w:t>The artifact checklist distinguishes source-controlled inputs from regenerated outputs. Metadata CSV subsets, scripts, configuration, and tests are versioned; plots, result JSON, and derived tables are intentionally reproducible outputs rather than opaque committed binaries. This separation makes it possible to audit the experiment after changing a dependency while preserving the exact seeds and held-out definitions used for the paper. It also avoids treating a static figure as the only evidence for a numerical claim.</w:t>
+      </w:r>
+    </w:p>
+    <w:p>
+      <w:pPr>
+        <w:spacing w:line="259" w:lineRule="auto"/>
+      </w:pPr>
+      <w:r>
+        <w:rPr>
+          <w:rFonts w:ascii="Times New Roman" w:hAnsi="Times New Roman"/>
+          <w:b w:val="0"/>
+          <w:i w:val="0"/>
+          <w:sz w:val="22"/>
+        </w:rPr>
+        <w:t>For an archival or double-blind release, the same checklist should be run in a clean environment and its generated outputs compared with the values reported here. Any discrepancy should be described rather than silently normalized away. The paper's claims are narrow enough that this verification is practical: the key question is whether random labeling remains the strongest CIC policy under the frozen protocol and whether the strict evaluations preserve the stated direction of the distribution-shift warning.</w:t>
       </w:r>
     </w:p>
     <w:p>

</xml_diff>

<commit_message>
Add repository/data/license/AI-use sections to PNAD workshop paper
- Added 6.1 Repository, data, and reproduction (repo URL, dataset attribution + license,
  exact reproduction commands) and 6.2 AI-use disclosure.
- Abstract already states the narrow active-learning claim and the 1%FPR recall caveat
  (0.585-0.668 on reweighted CIC) plus the in-distribution overstatement warning.
- Regenerated docx + PDF (9 pages); visually inspected every page.
- Ignore paper_render/.
</commit_message>
<xml_diff>
--- a/PNAD_anonymous_workshop_paper.docx
+++ b/PNAD_anonymous_workshop_paper.docx
@@ -3917,6 +3917,106 @@
           <w:i w:val="0"/>
           <w:sz w:val="24"/>
         </w:rPr>
+        <w:t>6.1 Repository, data, and reproduction</w:t>
+      </w:r>
+    </w:p>
+    <w:p>
+      <w:pPr>
+        <w:spacing w:line="259" w:lineRule="auto"/>
+      </w:pPr>
+      <w:r>
+        <w:rPr>
+          <w:rFonts w:ascii="Times New Roman" w:hAnsi="Times New Roman"/>
+          <w:b w:val="0"/>
+          <w:i w:val="0"/>
+          <w:sz w:val="22"/>
+        </w:rPr>
+        <w:t>Repository (anonymized for review): github.com/Farooq-Syed/python-network-anomaly-detector. Entry points: detector.py, benchmark_compare.py, active_learning_experiment.py, active_learning_stats.py, strict_generalization.py, cross_dataset.py, imbalance_eval.py, plus the prepare_unsw_nb15.py / prepare_cic_ids2017.py / scripts/download_datasets.py data pipeline. Frozen seeds, split definitions and preprocessing are recorded in reproducibility_config.json and requirements-lock.txt.</w:t>
+      </w:r>
+    </w:p>
+    <w:p>
+      <w:pPr>
+        <w:spacing w:line="259" w:lineRule="auto"/>
+      </w:pPr>
+      <w:r>
+        <w:rPr>
+          <w:rFonts w:ascii="Times New Roman" w:hAnsi="Times New Roman"/>
+          <w:b w:val="0"/>
+          <w:i w:val="0"/>
+          <w:sz w:val="22"/>
+        </w:rPr>
+        <w:t>Data attribution and license. UNSW-NB15 (N. Moustafa &amp; J. Slay, MilCIS 2015), CIC-IDS2017 (I. Sharafaldin, A. H. Lashkari, &amp; A. Ghorbani, ICISSP 2018), and CSE-CIC-IDS2018 (Canadian Institute for Cybersecurity) are public benchmark datasets used here for research evaluation only; each is subject to its author's license terms. The preprocessed subsets, scripts and code in this artifact are released under the repository's Non-Commercial Personal-Use License.</w:t>
+      </w:r>
+    </w:p>
+    <w:p>
+      <w:pPr>
+        <w:spacing w:line="259" w:lineRule="auto"/>
+      </w:pPr>
+      <w:r>
+        <w:rPr>
+          <w:rFonts w:ascii="Times New Roman" w:hAnsi="Times New Roman"/>
+          <w:b w:val="0"/>
+          <w:i w:val="0"/>
+          <w:sz w:val="22"/>
+        </w:rPr>
+        <w:t>Reproduction commands.</w:t>
+      </w:r>
+    </w:p>
+    <w:p>
+      <w:pPr>
+        <w:spacing w:line="259" w:lineRule="auto"/>
+      </w:pPr>
+      <w:r>
+        <w:rPr>
+          <w:rFonts w:ascii="Times New Roman" w:hAnsi="Times New Roman"/>
+          <w:b w:val="0"/>
+          <w:i w:val="0"/>
+          <w:sz w:val="22"/>
+        </w:rPr>
+        <w:t>python -m pip install -r requirements-lock.txt; python scripts/download_datasets.py --all; python benchmark_compare.py --input data/unsw_nb15_subset_with_family.csv --label-column label; python active_learning_stats.py --input data/cic_ids2017_subset_with_day.csv --label-column Label --budget 100 --seeds 8; python strict_generalization.py --input data/unsw_nb15_subset_with_family.csv --mode family --family-column family --label-column label; python cross_dataset.py --train data/cic_ids2017_subset_with_day.csv --test data/cse_cic_ids2018_subset.csv --label-column Label; python imbalance_eval.py --input data/cic_ids2017_subset_with_day.csv --label-column Label --attack-frac 0.05 --fpr 0.01; python -m pytest -q</w:t>
+      </w:r>
+    </w:p>
+    <w:p>
+      <w:pPr>
+        <w:keepNext/>
+        <w:spacing w:before="200" w:after="60"/>
+      </w:pPr>
+      <w:r>
+        <w:rPr>
+          <w:rFonts w:ascii="Times New Roman" w:hAnsi="Times New Roman"/>
+          <w:b/>
+          <w:i w:val="0"/>
+          <w:sz w:val="24"/>
+        </w:rPr>
+        <w:t>6.2 AI-use disclosure</w:t>
+      </w:r>
+    </w:p>
+    <w:p>
+      <w:pPr>
+        <w:spacing w:line="259" w:lineRule="auto"/>
+      </w:pPr>
+      <w:r>
+        <w:rPr>
+          <w:rFonts w:ascii="Times New Roman" w:hAnsi="Times New Roman"/>
+          <w:b w:val="0"/>
+          <w:i w:val="0"/>
+          <w:sz w:val="22"/>
+        </w:rPr>
+        <w:t>AI coding assistance was used during implementation and drafting. The author directed the research question, the benchmark evaluation protocol, the strict split and calibration design, the interpretation of the negative result, and reviewed and verified the final code and manuscript claims. AI assistance did not set the research direction or the claims.</w:t>
+      </w:r>
+    </w:p>
+    <w:p>
+      <w:pPr>
+        <w:keepNext/>
+        <w:spacing w:before="200" w:after="60"/>
+      </w:pPr>
+      <w:r>
+        <w:rPr>
+          <w:rFonts w:ascii="Times New Roman" w:hAnsi="Times New Roman"/>
+          <w:b/>
+          <w:i w:val="0"/>
+          <w:sz w:val="24"/>
+        </w:rPr>
         <w:t>7. Conclusion</w:t>
       </w:r>
     </w:p>

</xml_diff>